<commit_message>
hoan thien 50% phuong an vay von
</commit_message>
<xml_diff>
--- a/src/main/resources/templates/GiayDeNghiVayVon.docx
+++ b/src/main/resources/templates/GiayDeNghiVayVon.docx
@@ -773,13 +773,8 @@
       <w:r>
         <w:t xml:space="preserve"> </w:t>
       </w:r>
-      <w:bookmarkStart w:id="0" w:name="_GoBack"/>
-      <w:r>
-        <w:t>{{ndnb}}</w:t>
-      </w:r>
-      <w:bookmarkEnd w:id="0"/>
-      <w:r>
-        <w:t xml:space="preserve"> </w:t>
+      <w:r>
+        <w:t xml:space="preserve">{{ndnb}} </w:t>
       </w:r>
       <w:r>
         <w:t xml:space="preserve">số: </w:t>
@@ -897,7 +892,29 @@
         <w:spacing w:after="120"/>
       </w:pPr>
       <w:r>
-        <w:t>{{ncd}}.</w:t>
+        <w:t>- Nhà ở cố định: {{dienTichTS}}</w:t>
+      </w:r>
+      <w:r>
+        <w:t xml:space="preserve"> m</w:t>
+      </w:r>
+      <w:r>
+        <w:rPr>
+          <w:vertAlign w:val="superscript"/>
+        </w:rPr>
+        <w:t>2</w:t>
+      </w:r>
+      <w:bookmarkStart w:id="0" w:name="_GoBack"/>
+      <w:bookmarkEnd w:id="0"/>
+      <w:r>
+        <w:t>; loại nhà: {{ketCauXayDung}}.</w:t>
+      </w:r>
+    </w:p>
+    <w:p>
+      <w:pPr>
+        <w:spacing w:after="120"/>
+      </w:pPr>
+      <w:r>
+        <w:t>Được định giá: 0 đồng.</w:t>
       </w:r>
     </w:p>
     <w:p>
@@ -915,7 +932,13 @@
         <w:t xml:space="preserve"> </w:t>
       </w:r>
       <w:r>
-        <w:t xml:space="preserve"> {{tsbds}} đồng </w:t>
+        <w:t xml:space="preserve"> {{tsbds}} đồng</w:t>
+      </w:r>
+      <w:r>
+        <w:t>.</w:t>
+      </w:r>
+      <w:r>
+        <w:t xml:space="preserve"> </w:t>
       </w:r>
     </w:p>
     <w:p>

</xml_diff>